<commit_message>
Update KoreanStockBot release and GUI features
Co-authored-by: Copilot <223556219+Copilot@users.noreply.github.com>
</commit_message>
<xml_diff>
--- a/KoreanStockBot/KoreanStockBot_개발상세서.docx
+++ b/KoreanStockBot/KoreanStockBot_개발상세서.docx
@@ -28,6 +28,14 @@
     </w:p>
     <w:p>
       <w:pPr>
+        <w:pStyle w:val="Normal"/>
+      </w:pPr>
+      <w:r>
+        <w:t xml:space="preserve">EXE 배포 추가: release_entry.py, app_paths.py, KoreanStockBot.spec, build_release.ps1을 구현했습니다. 최신 빌드 방법은 7장과 EXE_BUILD_GUIDE.md를 참고하세요.</w:t>
+      </w:r>
+    </w:p>
+    <w:p>
+      <w:pPr>
         <w:pStyle w:val="Heading1"/>
       </w:pPr>
       <w:r>
@@ -55,7 +63,7 @@
         <w:pStyle w:val="Normal"/>
       </w:pPr>
       <w:r>
-        <w:t xml:space="preserve">현재까지 확인한 범위는 자동 테스트 69개와 세 GUI의 창·기간 선택·그래프·달력 동작입니다. 실제 계좌 연결·체결, 전략 수익성, EXE 배포는 검증되지 않았습니다. 10%는 목표이며 수익 보장이 아닙니다.</w:t>
+        <w:t xml:space="preserve">자동 테스트 73개와 세 GUI의 창·기간 선택·그래프·달력 동작을 확인했습니다. EXE의 오프라인 의존성·암호화·GUI 검사도 통과했습니다. 실제 계좌 연결·체결, API HUB 실키 호출, 전략 수익성 및 별도 깨끗한 PC에서의 실행은 검증하지 않았습니다. 10%는 목표이며 수익 보장이 아닙니다.</w:t>
       </w:r>
     </w:p>
     <w:p>
@@ -1380,143 +1388,175 @@
         <w:pStyle w:val="Heading1"/>
       </w:pPr>
       <w:r>
-        <w:t xml:space="preserve">7. EXE로 만드는 방법과 현재 한계</w:t>
-      </w:r>
-    </w:p>
-    <w:p>
-      <w:pPr>
-        <w:pStyle w:val="Normal"/>
-      </w:pPr>
-      <w:r>
-        <w:t xml:space="preserve">현재 배포 방식은 Python + 소스 폴더 + BAT입니다. 이 프로젝트에는 검증된 PyInstaller spec이나 EXE 빌드가 없습니다. 아래 절차는 향후 EXE 배포 작업의 설계 안내이며, 현재 코드를 그대로 묶으면 실전 기능이 정상 동작한다고 보장할 수 없습니다.</w:t>
-      </w:r>
-    </w:p>
-    <w:p>
-      <w:pPr>
-        <w:pStyle w:val="Normal"/>
-      </w:pPr>
-      <w:r>
-        <w:t xml:space="preserve">왜 단순 변환이 안 되나요? live_gui.py와 auto_research.py는 Python 실행 파일로 다른 .py 파일을 실행합니다. PyInstaller로 묶은 앱의 sys.executable은 Python이 아니라 앱 EXE를 가리킵니다. 또한 __file__ 기반 경로와 쓰기 가능한 데이터 경로를 분리해야 합니다. PyInstaller 실행 경로 설명 (https://pyinstaller.org/en/stable/runtime-information.html)</w:t>
-      </w:r>
-    </w:p>
-    <w:p>
-      <w:pPr>
-        <w:pStyle w:val="Normal"/>
-      </w:pPr>
-      <w:r>
-        <w:t xml:space="preserve">먼저 필요한 소스 변경:</w:t>
-      </w:r>
-    </w:p>
-    <w:p>
-      <w:pPr>
-        <w:pStyle w:val="Normal"/>
-      </w:pPr>
-      <w:r>
-        <w:t xml:space="preserve">1. GUI·거래 엔진·수집기를 각각 실행할 진입 파일을 만듭니다. 예: gui_entry.py, trader_entry.py, research_entry.py. 현재 저장소에 이 파일들은 없습니다.</w:t>
-      </w:r>
-    </w:p>
-    <w:p>
-      <w:pPr>
-        <w:pStyle w:val="Normal"/>
-      </w:pPr>
-      <w:r>
-        <w:t xml:space="preserve">2. 소스 실행 때는 Python + .py, EXE 실행 때는 전용 trader.exe·research.exe를 호출하도록 실행 경로 함수를 만듭니다. GUI EXE를 Python처럼 호출하면 안 됩니다.</w:t>
-      </w:r>
-    </w:p>
-    <w:p>
-      <w:pPr>
-        <w:pStyle w:val="Normal"/>
-      </w:pPr>
-      <w:r>
-        <w:t xml:space="preserve">3. 설정·runtime·research·STOP의 공통 쓰기 경로를 하나로 통일합니다. 임시 압축 해제 폴더나 프로그램 설치 전용 폴더에 장부를 저장하지 않습니다.</w:t>
-      </w:r>
-    </w:p>
-    <w:p>
-      <w:pPr>
-        <w:pStyle w:val="Normal"/>
-      </w:pPr>
-      <w:r>
-        <w:t xml:space="preserve">4. GUI만 --windowed로 만들고 거래·수집 작업은 로그 파이프가 가능한 콘솔 빌드로 만듭니다. GUI에서 자식 프로세스는 숨김 실행합니다.</w:t>
-      </w:r>
-    </w:p>
-    <w:p>
-      <w:pPr>
-        <w:pStyle w:val="Normal"/>
-      </w:pPr>
-      <w:r>
-        <w:t xml:space="preserve">5. pykrx의 지연 import, 패키지 데이터와 의존성을 수집합니다. 원본 설정 파일은 포함하되 키·장부·캐시·개인 자료는 묶지 않습니다.</w:t>
-      </w:r>
-    </w:p>
-    <w:p>
-      <w:pPr>
-        <w:pStyle w:val="Normal"/>
-      </w:pPr>
-      <w:r>
-        <w:t xml:space="preserve">필요한 변경을 마친 뒤 사용할 명령 형태는 아래와 같습니다. 아직 없는 진입 파일 이름을 쓴 설계 예제이므로 지금 그대로 실행하는 명령이 아닙니다.</w:t>
-      </w:r>
-    </w:p>
-    <w:p>
-      <w:pPr>
-        <w:pStyle w:val="Code"/>
-      </w:pPr>
-      <w:r>
-        <w:t xml:space="preserve"># EXE 전용 개발환경에서 설치. 버전을 검증한 뒤 빌드 요구사항에 고정</w:t>
-      </w:r>
-    </w:p>
-    <w:p>
-      <w:pPr>
-        <w:pStyle w:val="Code"/>
-      </w:pPr>
-      <w:r>
-        <w:t xml:space="preserve">.venv\Scripts\python.exe -m pip install pyinstaller</w:t>
-      </w:r>
-    </w:p>
-    <w:p>
-      <w:pPr>
-        <w:pStyle w:val="Code"/>
-      </w:pPr>
-      <w:r>
-        <w:t xml:space="preserve"># 아래 세 진입 파일과 경로 변경을 구현한 뒤 실행</w:t>
-      </w:r>
-    </w:p>
-    <w:p>
-      <w:pPr>
-        <w:pStyle w:val="Code"/>
-      </w:pPr>
-      <w:r>
-        <w:t xml:space="preserve">.venv\Scripts\python.exe -m PyInstaller --onedir --windowed --name KoreanStockBot gui_entry.py</w:t>
-      </w:r>
-    </w:p>
-    <w:p>
-      <w:pPr>
-        <w:pStyle w:val="Code"/>
-      </w:pPr>
-      <w:r>
-        <w:t xml:space="preserve">.venv\Scripts\python.exe -m PyInstaller --onedir --console --name trader trader_entry.py</w:t>
-      </w:r>
-    </w:p>
-    <w:p>
-      <w:pPr>
-        <w:pStyle w:val="Code"/>
-      </w:pPr>
-      <w:r>
-        <w:t xml:space="preserve">.venv\Scripts\python.exe -m PyInstaller --onedir --console --collect-all pykrx --name research research_entry.py</w:t>
-      </w:r>
-    </w:p>
-    <w:p>
-      <w:pPr>
-        <w:pStyle w:val="Normal"/>
-      </w:pPr>
-      <w:r>
-        <w:t xml:space="preserve">각 onedir 결과 폴더의 지원 파일을 유지하고 실행 경로 설계에 맞춰 배치합니다. EXE 하나만 꺼내 복사하지 않습니다. 먼저 onedir로 문제를 확인한 뒤 필요할 때 onefile을 검토합니다. Windows용은 Windows에서 빌드합니다. PyInstaller 사용법 (https://pyinstaller.org/en/stable/usage.html)</w:t>
-      </w:r>
-    </w:p>
-    <w:p>
-      <w:pPr>
-        <w:pStyle w:val="Normal"/>
-      </w:pPr>
-      <w:r>
-        <w:t xml:space="preserve">배포 검증 순서: 깨끗한 PC에서 창 열기 → 설정 읽기·암호화 → 가짜 API로 시작·중지·복구 → 읽기 전용 실제 인증 → 키 없는 배포물 확인. EXE 빌드 성공과 실제 거래 검증은 별도 단계입니다. 이 문서 작성 작업에서는 EXE를 생성하거나 실전 주문하지 않았습니다.</w:t>
+        <w:t xml:space="preserve">7. Windows EXE 빌드</w:t>
+      </w:r>
+    </w:p>
+    <w:p>
+      <w:pPr>
+        <w:pStyle w:val="Normal"/>
+      </w:pPr>
+      <w:r>
+        <w:t xml:space="preserve">현재 구현은 release_entry.py와 KoreanStockBot.spec을 사용합니다. 하나의 공통 라이브러리 폴더를 공유하는 다섯 EXE를 생성합니다.</w:t>
+      </w:r>
+    </w:p>
+    <w:p>
+      <w:pPr>
+        <w:pStyle w:val="Normal"/>
+      </w:pPr>
+      <w:r>
+        <w:t xml:space="preserve">- KoreanStockBotETF.exe: ETF GUI</w:t>
+      </w:r>
+    </w:p>
+    <w:p>
+      <w:pPr>
+        <w:pStyle w:val="Normal"/>
+      </w:pPr>
+      <w:r>
+        <w:t xml:space="preserve">- KoreanStockBotStock.exe: 단일 종목 GUI</w:t>
+      </w:r>
+    </w:p>
+    <w:p>
+      <w:pPr>
+        <w:pStyle w:val="Normal"/>
+      </w:pPr>
+      <w:r>
+        <w:t xml:space="preserve">- KoreanStockBotPaper.exe: 모의 GUI</w:t>
+      </w:r>
+    </w:p>
+    <w:p>
+      <w:pPr>
+        <w:pStyle w:val="Normal"/>
+      </w:pPr>
+      <w:r>
+        <w:t xml:space="preserve">- trader.exe: GUI가 호출하는 거래 엔진</w:t>
+      </w:r>
+    </w:p>
+    <w:p>
+      <w:pPr>
+        <w:pStyle w:val="Normal"/>
+      </w:pPr>
+      <w:r>
+        <w:t xml:space="preserve">- research.exe: 거래 엔진이 호출하는 ETF 자료 수집기</w:t>
+      </w:r>
+    </w:p>
+    <w:p>
+      <w:pPr>
+        <w:pStyle w:val="Normal"/>
+      </w:pPr>
+      <w:r>
+        <w:t xml:space="preserve">app_paths.py는 소스 실행에서는 프로젝트 폴더, EXE에서는 실행 파일 폴더를 설정·장부 공통 경로로 선택합니다. 소스에서는 Python + .py, 배포에서는 전용 작업 EXE를 호출합니다. 거래·수집기에는 콘솔 출력을 유지하고 GUI가 숨김 실행하여 상태 파이프를 읽습니다.</w:t>
+      </w:r>
+    </w:p>
+    <w:p>
+      <w:pPr>
+        <w:pStyle w:val="Heading2"/>
+      </w:pPr>
+      <w:r>
+        <w:t xml:space="preserve">빌드</w:t>
+      </w:r>
+    </w:p>
+    <w:p>
+      <w:pPr>
+        <w:pStyle w:val="Normal"/>
+      </w:pPr>
+      <w:r>
+        <w:t xml:space="preserve">프로젝트 폴더의 PowerShell에서 실행합니다.</w:t>
+      </w:r>
+    </w:p>
+    <w:p>
+      <w:pPr>
+        <w:pStyle w:val="Code"/>
+      </w:pPr>
+      <w:r>
+        <w:t xml:space="preserve">.venv\Scripts\python.exe -m pip install -r requirements-build.txt</w:t>
+      </w:r>
+    </w:p>
+    <w:p>
+      <w:pPr>
+        <w:pStyle w:val="Code"/>
+      </w:pPr>
+      <w:r>
+        <w:t xml:space="preserve">.venv\Scripts\python.exe -X utf8 -m unittest -v</w:t>
+      </w:r>
+    </w:p>
+    <w:p>
+      <w:pPr>
+        <w:pStyle w:val="Code"/>
+      </w:pPr>
+      <w:r>
+        <w:t xml:space="preserve">powershell -NoProfile -ExecutionPolicy Bypass -File build_release.ps1</w:t>
+      </w:r>
+    </w:p>
+    <w:p>
+      <w:pPr>
+        <w:pStyle w:val="Normal"/>
+      </w:pPr>
+      <w:r>
+        <w:t xml:space="preserve">Release/KoreanStockBot/에 결과가 생성됩니다. 기존 배포 폴더에 runtime 또는 research가 있으면 덮어쓰지 않고 중단합니다. 운용 중인 배포 폴더를 빌드 출력 위치로 사용하지 마세요. 새 체크아웃에서 빌드하세요.</w:t>
+      </w:r>
+    </w:p>
+    <w:p>
+      <w:pPr>
+        <w:pStyle w:val="Heading2"/>
+      </w:pPr>
+      <w:r>
+        <w:t xml:space="preserve">오프라인 검증</w:t>
+      </w:r>
+    </w:p>
+    <w:p>
+      <w:pPr>
+        <w:pStyle w:val="Code"/>
+      </w:pPr>
+      <w:r>
+        <w:t xml:space="preserve">Release\KoreanStockBot\trader.exe --self-test</w:t>
+      </w:r>
+    </w:p>
+    <w:p>
+      <w:pPr>
+        <w:pStyle w:val="Code"/>
+      </w:pPr>
+      <w:r>
+        <w:t xml:space="preserve">Release\KoreanStockBot\research.exe --self-test</w:t>
+      </w:r>
+    </w:p>
+    <w:p>
+      <w:pPr>
+        <w:pStyle w:val="Code"/>
+      </w:pPr>
+      <w:r>
+        <w:t xml:space="preserve">Release\KoreanStockBot\trader.exe --gui-smoke</w:t>
+      </w:r>
+    </w:p>
+    <w:p>
+      <w:pPr>
+        <w:pStyle w:val="Normal"/>
+      </w:pPr>
+      <w:r>
+        <w:t xml:space="preserve">인증정보 읽기·API 호출·주문 없이 패키지 의존성, 암호화 왕복, 모의 계산, 세 GUI의 그래프·달력 동작을 확인합니다. 실제 인증을 사용하는 KRX 수집과 토스 체결의 검증을 대신하지 않습니다.</w:t>
+      </w:r>
+    </w:p>
+    <w:p>
+      <w:pPr>
+        <w:pStyle w:val="Heading2"/>
+      </w:pPr>
+      <w:r>
+        <w:t xml:space="preserve">전달·업데이트</w:t>
+      </w:r>
+    </w:p>
+    <w:p>
+      <w:pPr>
+        <w:pStyle w:val="Normal"/>
+      </w:pPr>
+      <w:r>
+        <w:t xml:space="preserve">EXE만 분리하지 말고 _internal, 설정, 보조 EXE를 포함한 폴더 전체를 전달합니다. 개인 runtime·캐시·키는 배포물에 포함하지 않습니다. 기존 계좌를 계속 운용할 때는 거래 중지·주문 확인 후 기존 설정과 장부를 보존하는 이전이 필요합니다. 다른 폴더에서 같은 계좌 봇을 동시에 실행하지 않습니다.</w:t>
+      </w:r>
+    </w:p>
+    <w:p>
+      <w:pPr>
+        <w:pStyle w:val="Normal"/>
+      </w:pPr>
+      <w:r>
+        <w:t xml:space="preserve">PyInstaller는 파이썬 환경과 의존성을 묶는 배포 도구이며 소스코드 보호나 수익성을 보장하지 않습니다. 코드 서명은 적용하지 않았습니다. Windows 64비트에서 빌드하며 다른 운영체제용 EXE는 아닙니다.</w:t>
       </w:r>
     </w:p>
     <w:p>
@@ -3810,7 +3850,23 @@
         <w:pStyle w:val="Normal"/>
       </w:pPr>
       <w:r>
-        <w:t xml:space="preserve">- 네이버 검색: https://developers.naver.com/docs/serviceapi/search/news/news.md</w:t>
+        <w:t xml:space="preserve">- NAVER API HUB 뉴스: https://api.ncloud-docs.com/docs/naver-api-hub-search-news</w:t>
+      </w:r>
+    </w:p>
+    <w:p>
+      <w:pPr>
+        <w:pStyle w:val="Normal"/>
+      </w:pPr>
+      <w:r>
+        <w:t xml:space="preserve">- NAVER API HUB 가입·앱 등록: https://guide.ncloud-docs.com/docs/apihub-application</w:t>
+      </w:r>
+    </w:p>
+    <w:p>
+      <w:pPr>
+        <w:pStyle w:val="Normal"/>
+      </w:pPr>
+      <w:r>
+        <w:t xml:space="preserve">뉴스 연동은 https://naverapihub.apigw.ntruss.com/search/v1/news 에 format=json으로 요청합니다. 인증 헤더는 X-NCP-APIGW-API-KEY-ID와 X-NCP-APIGW-API-KEY입니다. 로컬 설정 이름 NAVER_CLIENT_ID / NAVER_CLIENT_SECRET은 유지하되 API HUB에서 발급한 값을 입력합니다. 기존 API로 자동 전환하지 않습니다. 뉴스 캐시는 시간 단위이며 새 URL로 기존 캐시와 분리됩니다. test_news_hub.py에서 요청 형식·시간별 캐시·오류 응답 저장 방지를 검사합니다.</w:t>
       </w:r>
     </w:p>
     <w:p>

</xml_diff>